<commit_message>
Docs: Treasure Row covers and logo, Times New Roman, previous team names and The Vault removed
Also restores the current Design Spec, Functional Spec, and Requirements that
were dropped from develop, replaces the Functional Spec PDFs with Word files,
and keeps the current Test Plan and Project Plan (TC-42 to TC-51, 137+ tests).

Co-Authored-By: Claude Opus 5.5 <noreply@anthropic.com>
</commit_message>
<xml_diff>
--- a/docs/project-plan/Project_Plan_BEFORE_TreasureRow.docx
+++ b/docs/project-plan/Project_Plan_BEFORE_TreasureRow.docx
@@ -2,28 +2,72 @@
 <file path=word/document.xml><?xml version="1.0" encoding="utf-8"?>
 <w:document xmlns:wpc="http://schemas.microsoft.com/office/word/2010/wordprocessingCanvas" xmlns:mo="http://schemas.microsoft.com/office/mac/office/2008/main" xmlns:mc="http://schemas.openxmlformats.org/markup-compatibility/2006" xmlns:mv="urn:schemas-microsoft-com:mac:vml" xmlns:o="urn:schemas-microsoft-com:office:office" xmlns:r="http://schemas.openxmlformats.org/officeDocument/2006/relationships" xmlns:m="http://schemas.openxmlformats.org/officeDocument/2006/math" xmlns:v="urn:schemas-microsoft-com:vml" xmlns:wp14="http://schemas.microsoft.com/office/word/2010/wordprocessingDrawing" xmlns:wp="http://schemas.openxmlformats.org/drawingml/2006/wordprocessingDrawing" xmlns:w10="urn:schemas-microsoft-com:office:word" xmlns:w="http://schemas.openxmlformats.org/wordprocessingml/2006/main" xmlns:w14="http://schemas.microsoft.com/office/word/2010/wordml" xmlns:wpg="http://schemas.microsoft.com/office/word/2010/wordprocessingGroup" xmlns:wpi="http://schemas.microsoft.com/office/word/2010/wordprocessingInk" xmlns:wne="http://schemas.microsoft.com/office/word/2006/wordml" xmlns:wps="http://schemas.microsoft.com/office/word/2010/wordprocessingShape" mc:Ignorable="w14 wp14">
   <w:body>
-    <w:p>
+    <w:p xmlns:a="http://schemas.openxmlformats.org/drawingml/2006/main" xmlns:pic="http://schemas.openxmlformats.org/drawingml/2006/picture">
       <w:pPr>
+        <w:spacing w:after="60"/>
         <w:jc w:val="center"/>
       </w:pPr>
       <w:r>
         <w:rPr>
+          <w:rFonts w:ascii="Times New Roman" w:hAnsi="Times New Roman" w:cs="Times New Roman" w:eastAsia="Times New Roman"/>
           <w:b/>
-          <w:sz w:val="52"/>
+          <w:sz w:val="48"/>
+          <w:szCs w:val="48"/>
         </w:rPr>
         <w:t>Treasure Row</w:t>
       </w:r>
     </w:p>
-    <w:p>
+    <w:p xmlns:a="http://schemas.openxmlformats.org/drawingml/2006/main" xmlns:pic="http://schemas.openxmlformats.org/drawingml/2006/picture">
       <w:pPr>
+        <w:spacing w:after="120"/>
         <w:jc w:val="center"/>
       </w:pPr>
       <w:r>
         <w:rPr>
-          <w:b/>
-          <w:sz w:val="24"/>
+          <w:rFonts w:ascii="Times New Roman" w:hAnsi="Times New Roman" w:cs="Times New Roman" w:eastAsia="Times New Roman"/>
+          <w:sz w:val="22"/>
+          <w:szCs w:val="22"/>
         </w:rPr>
-        <w:t>Donovan Griffin, Jonah Goodwine, Cameron Ridgley, Chase Jones, Ricki Davis, Chi Martin, Noah Higgs</w:t>
+        <w:t xml:space="preserve">Donovan Griffin, Cameron Ridgley, Jonah Goodwine, Ricki Davis, Chase Jones, Noah Higgs, Chi Martin</w:t>
+      </w:r>
+    </w:p>
+    <w:p xmlns:a="http://schemas.openxmlformats.org/drawingml/2006/main" xmlns:pic="http://schemas.openxmlformats.org/drawingml/2006/picture">
+      <w:pPr>
+        <w:spacing w:after="240"/>
+        <w:jc w:val="center"/>
+      </w:pPr>
+      <w:r>
+        <w:drawing>
+          <wp:inline distT="0" distB="0" distL="0" distR="0">
+            <wp:extent cx="2011680" cy="1644192"/>
+            <wp:docPr id="90001" name="Treasure Row logo"/>
+            <a:graphic>
+              <a:graphicData uri="http://schemas.openxmlformats.org/drawingml/2006/picture">
+                <pic:pic>
+                  <pic:nvPicPr>
+                    <pic:cNvPr id="90001" name="treasure_row_logo.png"/>
+                    <pic:cNvPicPr/>
+                  </pic:nvPicPr>
+                  <pic:blipFill>
+                    <a:blip r:embed="rIdTRCoverLogo"/>
+                    <a:stretch>
+                      <a:fillRect/>
+                    </a:stretch>
+                  </pic:blipFill>
+                  <pic:spPr>
+                    <a:xfrm>
+                      <a:off x="0" y="0"/>
+                      <a:ext cx="2011680" cy="1644192"/>
+                    </a:xfrm>
+                    <a:prstGeom prst="rect">
+                      <a:avLst/>
+                    </a:prstGeom>
+                  </pic:spPr>
+                </pic:pic>
+              </a:graphicData>
+            </a:graphic>
+          </wp:inline>
+        </w:drawing>
       </w:r>
     </w:p>
     <w:p>
@@ -35,7 +79,7 @@
           <w:i/>
           <w:sz w:val="28"/>
         </w:rPr>
-        <w:t>Project Plan — Continuing The Vault</w:t>
+        <w:t>Project Plan</w:t>
       </w:r>
     </w:p>
     <w:p/>
@@ -59,18 +103,11 @@
       <w:hyperlink w:anchor="toc_1">
         <w:r>
           <w:rPr>
-            <w:rFonts w:ascii="Times New Roman" w:hAnsi="Times New Roman"/>
+            <w:rFonts w:ascii="Times New Roman" w:hAnsi="Times New Roman" w:cs="Times New Roman" w:eastAsia="Times New Roman"/>
             <w:b/>
             <w:sz w:val="24"/>
           </w:rPr>
           <w:t>1.0 Introduction</w:t>
-        </w:r>
-        <w:r>
-          <w:rPr>
-            <w:rFonts w:ascii="Times New Roman" w:hAnsi="Times New Roman"/>
-            <w:b/>
-            <w:sz w:val="24"/>
-          </w:rPr>
           <w:tab/>
           <w:t>2</w:t>
         </w:r>
@@ -87,18 +124,11 @@
       <w:hyperlink w:anchor="toc_1_1">
         <w:r>
           <w:rPr>
-            <w:rFonts w:ascii="Times New Roman" w:hAnsi="Times New Roman"/>
+            <w:rFonts w:ascii="Times New Roman" w:hAnsi="Times New Roman" w:cs="Times New Roman" w:eastAsia="Times New Roman"/>
             <w:b w:val="0"/>
             <w:sz w:val="22"/>
           </w:rPr>
           <w:t>1.1 Project Scope</w:t>
-        </w:r>
-        <w:r>
-          <w:rPr>
-            <w:rFonts w:ascii="Times New Roman" w:hAnsi="Times New Roman"/>
-            <w:b w:val="0"/>
-            <w:sz w:val="22"/>
-          </w:rPr>
           <w:tab/>
           <w:t>2</w:t>
         </w:r>
@@ -115,18 +145,11 @@
       <w:hyperlink w:anchor="toc_1_2">
         <w:r>
           <w:rPr>
-            <w:rFonts w:ascii="Times New Roman" w:hAnsi="Times New Roman"/>
+            <w:rFonts w:ascii="Times New Roman" w:hAnsi="Times New Roman" w:cs="Times New Roman" w:eastAsia="Times New Roman"/>
             <w:b w:val="0"/>
             <w:sz w:val="22"/>
           </w:rPr>
           <w:t>1.2 Major Software Functions</w:t>
-        </w:r>
-        <w:r>
-          <w:rPr>
-            <w:rFonts w:ascii="Times New Roman" w:hAnsi="Times New Roman"/>
-            <w:b w:val="0"/>
-            <w:sz w:val="22"/>
-          </w:rPr>
           <w:tab/>
           <w:t>2</w:t>
         </w:r>
@@ -143,18 +166,11 @@
       <w:hyperlink w:anchor="toc_1_3">
         <w:r>
           <w:rPr>
-            <w:rFonts w:ascii="Times New Roman" w:hAnsi="Times New Roman"/>
+            <w:rFonts w:ascii="Times New Roman" w:hAnsi="Times New Roman" w:cs="Times New Roman" w:eastAsia="Times New Roman"/>
             <w:b w:val="0"/>
             <w:sz w:val="22"/>
           </w:rPr>
           <w:t>1.3 Performance/Behavior Issues</w:t>
-        </w:r>
-        <w:r>
-          <w:rPr>
-            <w:rFonts w:ascii="Times New Roman" w:hAnsi="Times New Roman"/>
-            <w:b w:val="0"/>
-            <w:sz w:val="22"/>
-          </w:rPr>
           <w:tab/>
           <w:t>3</w:t>
         </w:r>
@@ -171,18 +187,11 @@
       <w:hyperlink w:anchor="toc_1_4">
         <w:r>
           <w:rPr>
-            <w:rFonts w:ascii="Times New Roman" w:hAnsi="Times New Roman"/>
+            <w:rFonts w:ascii="Times New Roman" w:hAnsi="Times New Roman" w:cs="Times New Roman" w:eastAsia="Times New Roman"/>
             <w:b w:val="0"/>
             <w:sz w:val="22"/>
           </w:rPr>
           <w:t>1.4 Management and Technical Constraints</w:t>
-        </w:r>
-        <w:r>
-          <w:rPr>
-            <w:rFonts w:ascii="Times New Roman" w:hAnsi="Times New Roman"/>
-            <w:b w:val="0"/>
-            <w:sz w:val="22"/>
-          </w:rPr>
           <w:tab/>
           <w:t>3</w:t>
         </w:r>
@@ -199,18 +208,11 @@
       <w:hyperlink w:anchor="toc_1_5">
         <w:r>
           <w:rPr>
-            <w:rFonts w:ascii="Times New Roman" w:hAnsi="Times New Roman"/>
+            <w:rFonts w:ascii="Times New Roman" w:hAnsi="Times New Roman" w:cs="Times New Roman" w:eastAsia="Times New Roman"/>
             <w:b w:val="0"/>
             <w:sz w:val="22"/>
           </w:rPr>
           <w:t>1.5 Tools and Technologies</w:t>
-        </w:r>
-        <w:r>
-          <w:rPr>
-            <w:rFonts w:ascii="Times New Roman" w:hAnsi="Times New Roman"/>
-            <w:b w:val="0"/>
-            <w:sz w:val="22"/>
-          </w:rPr>
           <w:tab/>
           <w:t>4</w:t>
         </w:r>
@@ -227,18 +229,11 @@
       <w:hyperlink w:anchor="toc_2">
         <w:r>
           <w:rPr>
-            <w:rFonts w:ascii="Times New Roman" w:hAnsi="Times New Roman"/>
+            <w:rFonts w:ascii="Times New Roman" w:hAnsi="Times New Roman" w:cs="Times New Roman" w:eastAsia="Times New Roman"/>
             <w:b/>
             <w:sz w:val="24"/>
           </w:rPr>
           <w:t>2.0 Project Estimates</w:t>
-        </w:r>
-        <w:r>
-          <w:rPr>
-            <w:rFonts w:ascii="Times New Roman" w:hAnsi="Times New Roman"/>
-            <w:b/>
-            <w:sz w:val="24"/>
-          </w:rPr>
           <w:tab/>
           <w:t>4</w:t>
         </w:r>
@@ -255,18 +250,11 @@
       <w:hyperlink w:anchor="toc_2_1">
         <w:r>
           <w:rPr>
-            <w:rFonts w:ascii="Times New Roman" w:hAnsi="Times New Roman"/>
+            <w:rFonts w:ascii="Times New Roman" w:hAnsi="Times New Roman" w:cs="Times New Roman" w:eastAsia="Times New Roman"/>
             <w:b w:val="0"/>
             <w:sz w:val="22"/>
           </w:rPr>
           <w:t>2.1 Historical Data Used for Estimates</w:t>
-        </w:r>
-        <w:r>
-          <w:rPr>
-            <w:rFonts w:ascii="Times New Roman" w:hAnsi="Times New Roman"/>
-            <w:b w:val="0"/>
-            <w:sz w:val="22"/>
-          </w:rPr>
           <w:tab/>
           <w:t>4</w:t>
         </w:r>
@@ -283,18 +271,11 @@
       <w:hyperlink w:anchor="toc_2_2">
         <w:r>
           <w:rPr>
-            <w:rFonts w:ascii="Times New Roman" w:hAnsi="Times New Roman"/>
+            <w:rFonts w:ascii="Times New Roman" w:hAnsi="Times New Roman" w:cs="Times New Roman" w:eastAsia="Times New Roman"/>
             <w:b w:val="0"/>
             <w:sz w:val="22"/>
           </w:rPr>
           <w:t>2.2 Project Resources</w:t>
-        </w:r>
-        <w:r>
-          <w:rPr>
-            <w:rFonts w:ascii="Times New Roman" w:hAnsi="Times New Roman"/>
-            <w:b w:val="0"/>
-            <w:sz w:val="22"/>
-          </w:rPr>
           <w:tab/>
           <w:t>4</w:t>
         </w:r>
@@ -311,18 +292,11 @@
       <w:hyperlink w:anchor="toc_3">
         <w:r>
           <w:rPr>
-            <w:rFonts w:ascii="Times New Roman" w:hAnsi="Times New Roman"/>
+            <w:rFonts w:ascii="Times New Roman" w:hAnsi="Times New Roman" w:cs="Times New Roman" w:eastAsia="Times New Roman"/>
             <w:b/>
             <w:sz w:val="24"/>
           </w:rPr>
           <w:t>3.0 Risk Management</w:t>
-        </w:r>
-        <w:r>
-          <w:rPr>
-            <w:rFonts w:ascii="Times New Roman" w:hAnsi="Times New Roman"/>
-            <w:b/>
-            <w:sz w:val="24"/>
-          </w:rPr>
           <w:tab/>
           <w:t>4</w:t>
         </w:r>
@@ -339,18 +313,11 @@
       <w:hyperlink w:anchor="toc_3_1">
         <w:r>
           <w:rPr>
-            <w:rFonts w:ascii="Times New Roman" w:hAnsi="Times New Roman"/>
+            <w:rFonts w:ascii="Times New Roman" w:hAnsi="Times New Roman" w:cs="Times New Roman" w:eastAsia="Times New Roman"/>
             <w:b w:val="0"/>
             <w:sz w:val="22"/>
           </w:rPr>
           <w:t>3.1 Project Risks</w:t>
-        </w:r>
-        <w:r>
-          <w:rPr>
-            <w:rFonts w:ascii="Times New Roman" w:hAnsi="Times New Roman"/>
-            <w:b w:val="0"/>
-            <w:sz w:val="22"/>
-          </w:rPr>
           <w:tab/>
           <w:t>4</w:t>
         </w:r>
@@ -367,18 +334,11 @@
       <w:hyperlink w:anchor="toc_3_2">
         <w:r>
           <w:rPr>
-            <w:rFonts w:ascii="Times New Roman" w:hAnsi="Times New Roman"/>
+            <w:rFonts w:ascii="Times New Roman" w:hAnsi="Times New Roman" w:cs="Times New Roman" w:eastAsia="Times New Roman"/>
             <w:b w:val="0"/>
             <w:sz w:val="22"/>
           </w:rPr>
           <w:t>3.2 Risk Table</w:t>
-        </w:r>
-        <w:r>
-          <w:rPr>
-            <w:rFonts w:ascii="Times New Roman" w:hAnsi="Times New Roman"/>
-            <w:b w:val="0"/>
-            <w:sz w:val="22"/>
-          </w:rPr>
           <w:tab/>
           <w:t>5</w:t>
         </w:r>
@@ -395,18 +355,11 @@
       <w:hyperlink w:anchor="toc_4">
         <w:r>
           <w:rPr>
-            <w:rFonts w:ascii="Times New Roman" w:hAnsi="Times New Roman"/>
+            <w:rFonts w:ascii="Times New Roman" w:hAnsi="Times New Roman" w:cs="Times New Roman" w:eastAsia="Times New Roman"/>
             <w:b/>
             <w:sz w:val="24"/>
           </w:rPr>
           <w:t>4.0 Project Schedule</w:t>
-        </w:r>
-        <w:r>
-          <w:rPr>
-            <w:rFonts w:ascii="Times New Roman" w:hAnsi="Times New Roman"/>
-            <w:b/>
-            <w:sz w:val="24"/>
-          </w:rPr>
           <w:tab/>
           <w:t>5</w:t>
         </w:r>
@@ -423,18 +376,11 @@
       <w:hyperlink w:anchor="toc_4_1">
         <w:r>
           <w:rPr>
-            <w:rFonts w:ascii="Times New Roman" w:hAnsi="Times New Roman"/>
+            <w:rFonts w:ascii="Times New Roman" w:hAnsi="Times New Roman" w:cs="Times New Roman" w:eastAsia="Times New Roman"/>
             <w:b w:val="0"/>
             <w:sz w:val="22"/>
           </w:rPr>
           <w:t>4.1 Project Task Set</w:t>
-        </w:r>
-        <w:r>
-          <w:rPr>
-            <w:rFonts w:ascii="Times New Roman" w:hAnsi="Times New Roman"/>
-            <w:b w:val="0"/>
-            <w:sz w:val="22"/>
-          </w:rPr>
           <w:tab/>
           <w:t>5</w:t>
         </w:r>
@@ -451,18 +397,11 @@
       <w:hyperlink w:anchor="toc_4_2">
         <w:r>
           <w:rPr>
-            <w:rFonts w:ascii="Times New Roman" w:hAnsi="Times New Roman"/>
+            <w:rFonts w:ascii="Times New Roman" w:hAnsi="Times New Roman" w:cs="Times New Roman" w:eastAsia="Times New Roman"/>
             <w:b w:val="0"/>
             <w:sz w:val="22"/>
           </w:rPr>
           <w:t>4.2 Timeline Chart — Iterations 1–6</w:t>
-        </w:r>
-        <w:r>
-          <w:rPr>
-            <w:rFonts w:ascii="Times New Roman" w:hAnsi="Times New Roman"/>
-            <w:b w:val="0"/>
-            <w:sz w:val="22"/>
-          </w:rPr>
           <w:tab/>
           <w:t>6</w:t>
         </w:r>
@@ -479,18 +418,11 @@
       <w:hyperlink w:anchor="toc_5">
         <w:r>
           <w:rPr>
-            <w:rFonts w:ascii="Times New Roman" w:hAnsi="Times New Roman"/>
+            <w:rFonts w:ascii="Times New Roman" w:hAnsi="Times New Roman" w:cs="Times New Roman" w:eastAsia="Times New Roman"/>
             <w:b/>
             <w:sz w:val="24"/>
           </w:rPr>
           <w:t>5.0 Staff Organization</w:t>
-        </w:r>
-        <w:r>
-          <w:rPr>
-            <w:rFonts w:ascii="Times New Roman" w:hAnsi="Times New Roman"/>
-            <w:b/>
-            <w:sz w:val="24"/>
-          </w:rPr>
           <w:tab/>
           <w:t>6</w:t>
         </w:r>
@@ -507,18 +439,11 @@
       <w:hyperlink w:anchor="toc_5_1">
         <w:r>
           <w:rPr>
-            <w:rFonts w:ascii="Times New Roman" w:hAnsi="Times New Roman"/>
+            <w:rFonts w:ascii="Times New Roman" w:hAnsi="Times New Roman" w:cs="Times New Roman" w:eastAsia="Times New Roman"/>
             <w:b w:val="0"/>
             <w:sz w:val="22"/>
           </w:rPr>
           <w:t>5.1 Team Structure</w:t>
-        </w:r>
-        <w:r>
-          <w:rPr>
-            <w:rFonts w:ascii="Times New Roman" w:hAnsi="Times New Roman"/>
-            <w:b w:val="0"/>
-            <w:sz w:val="22"/>
-          </w:rPr>
           <w:tab/>
           <w:t>6</w:t>
         </w:r>
@@ -535,18 +460,11 @@
       <w:hyperlink w:anchor="toc_5_2">
         <w:r>
           <w:rPr>
-            <w:rFonts w:ascii="Times New Roman" w:hAnsi="Times New Roman"/>
+            <w:rFonts w:ascii="Times New Roman" w:hAnsi="Times New Roman" w:cs="Times New Roman" w:eastAsia="Times New Roman"/>
             <w:b w:val="0"/>
             <w:sz w:val="22"/>
           </w:rPr>
           <w:t>5.2 Management Reporting and Communication</w:t>
-        </w:r>
-        <w:r>
-          <w:rPr>
-            <w:rFonts w:ascii="Times New Roman" w:hAnsi="Times New Roman"/>
-            <w:b w:val="0"/>
-            <w:sz w:val="22"/>
-          </w:rPr>
           <w:tab/>
           <w:t>7</w:t>
         </w:r>
@@ -563,18 +481,11 @@
       <w:hyperlink w:anchor="toc_6">
         <w:r>
           <w:rPr>
-            <w:rFonts w:ascii="Times New Roman" w:hAnsi="Times New Roman"/>
+            <w:rFonts w:ascii="Times New Roman" w:hAnsi="Times New Roman" w:cs="Times New Roman" w:eastAsia="Times New Roman"/>
             <w:b/>
             <w:sz w:val="24"/>
           </w:rPr>
           <w:t>6.0 Tracking and Control Mechanisms</w:t>
-        </w:r>
-        <w:r>
-          <w:rPr>
-            <w:rFonts w:ascii="Times New Roman" w:hAnsi="Times New Roman"/>
-            <w:b/>
-            <w:sz w:val="24"/>
-          </w:rPr>
           <w:tab/>
           <w:t>7</w:t>
         </w:r>
@@ -591,18 +502,11 @@
       <w:hyperlink w:anchor="toc_6_1">
         <w:r>
           <w:rPr>
-            <w:rFonts w:ascii="Times New Roman" w:hAnsi="Times New Roman"/>
+            <w:rFonts w:ascii="Times New Roman" w:hAnsi="Times New Roman" w:cs="Times New Roman" w:eastAsia="Times New Roman"/>
             <w:b w:val="0"/>
             <w:sz w:val="22"/>
           </w:rPr>
           <w:t>6.1 Quality Assurance and Control</w:t>
-        </w:r>
-        <w:r>
-          <w:rPr>
-            <w:rFonts w:ascii="Times New Roman" w:hAnsi="Times New Roman"/>
-            <w:b w:val="0"/>
-            <w:sz w:val="22"/>
-          </w:rPr>
           <w:tab/>
           <w:t>7</w:t>
         </w:r>
@@ -619,18 +523,11 @@
       <w:hyperlink w:anchor="toc_7">
         <w:r>
           <w:rPr>
-            <w:rFonts w:ascii="Times New Roman" w:hAnsi="Times New Roman"/>
+            <w:rFonts w:ascii="Times New Roman" w:hAnsi="Times New Roman" w:cs="Times New Roman" w:eastAsia="Times New Roman"/>
             <w:b/>
             <w:sz w:val="24"/>
           </w:rPr>
           <w:t>7.0 Revision Log</w:t>
-        </w:r>
-        <w:r>
-          <w:rPr>
-            <w:rFonts w:ascii="Times New Roman" w:hAnsi="Times New Roman"/>
-            <w:b/>
-            <w:sz w:val="24"/>
-          </w:rPr>
           <w:tab/>
           <w:t>7</w:t>
         </w:r>
@@ -663,7 +560,7 @@
     </w:p>
     <w:p>
       <w:r>
-        <w:t>The Vault is a campus marketplace web application built for Hampton University students: users create accounts, open a personal storefront, list clothing items for sale, browse and search other storefronts, manage a wishlist and cart, check out, and submit returns. Treasure Row is continuing development of The Vault rather than CloudMart, based on the team's Iteration 1 Evaluation. The Vault's backend is built on a well-documented layered architecture (controllers, services, models) with its own in-repo README describing that structure, and its core buyer and seller flows — signup through checkout, returns, and admin review — were independently verified working end to end during Iteration 1. CloudMart's cart and much of its documented feature set existed only in the browser or not at all, its database connection depended on a single hardcoded EC2 instance that was unreachable during testing, and its documentation repeatedly contradicted the code it was supposed to describe.</w:t>
+        <w:t>Treasure Row is a campus marketplace web application built for Hampton University students: users create accounts, open a personal storefront, list clothing items for sale, browse and search other storefronts, manage a wishlist and cart, check out, and submit returns. Treasure Row is continuing development of Treasure Row rather than CloudMart, based on the team's Iteration 1 Evaluation. Treasure Row's backend is built on a well-documented layered architecture (controllers, services, models) with its own in-repo README describing that structure, and its core buyer and seller flows — signup through checkout, returns, and admin review — were independently verified working end to end during Iteration 1. CloudMart's cart and much of its documented feature set existed only in the browser or not at all, its database connection depended on a single hardcoded EC2 instance that was unreachable during testing, and its documentation repeatedly contradicted the code it was supposed to describe.</w:t>
       </w:r>
     </w:p>
     <w:p>
@@ -1098,7 +995,7 @@
     </w:p>
     <w:p>
       <w:r>
-        <w:t>Codebase: The Vault (inherited from the predecessor team, CSC 405)</w:t>
+        <w:t>Codebase: Treasure Row (inherited from the predecessor team, CSC 405)</w:t>
       </w:r>
     </w:p>
     <w:p>
@@ -2263,7 +2160,7 @@
         <w:ind w:left="1440" w:hanging="360"/>
       </w:pPr>
       <w:rPr>
-        <w:rFonts w:ascii="Symbol" w:hAnsi="Symbol" w:hint="default"/>
+        <w:rFonts w:ascii="Times New Roman" w:hAnsi="Times New Roman" w:cs="Times New Roman" w:eastAsia="Times New Roman"/>
       </w:rPr>
     </w:lvl>
   </w:abstractNum>
@@ -2284,7 +2181,7 @@
         <w:ind w:left="1080" w:hanging="360"/>
       </w:pPr>
       <w:rPr>
-        <w:rFonts w:ascii="Symbol" w:hAnsi="Symbol" w:hint="default"/>
+        <w:rFonts w:ascii="Times New Roman" w:hAnsi="Times New Roman" w:cs="Times New Roman" w:eastAsia="Times New Roman"/>
       </w:rPr>
     </w:lvl>
   </w:abstractNum>
@@ -2305,7 +2202,7 @@
         <w:ind w:left="720" w:hanging="360"/>
       </w:pPr>
       <w:rPr>
-        <w:rFonts w:ascii="Symbol" w:hAnsi="Symbol" w:hint="default"/>
+        <w:rFonts w:ascii="Times New Roman" w:hAnsi="Times New Roman" w:cs="Times New Roman" w:eastAsia="Times New Roman"/>
       </w:rPr>
     </w:lvl>
   </w:abstractNum>
@@ -2344,7 +2241,7 @@
         <w:ind w:left="360" w:hanging="360"/>
       </w:pPr>
       <w:rPr>
-        <w:rFonts w:ascii="Symbol" w:hAnsi="Symbol" w:hint="default"/>
+        <w:rFonts w:ascii="Times New Roman" w:hAnsi="Times New Roman" w:cs="Times New Roman" w:eastAsia="Times New Roman"/>
       </w:rPr>
     </w:lvl>
   </w:abstractNum>
@@ -2383,7 +2280,7 @@
   <w:docDefaults>
     <w:rPrDefault>
       <w:rPr>
-        <w:rFonts w:asciiTheme="minorHAnsi" w:eastAsiaTheme="minorEastAsia" w:hAnsiTheme="minorHAnsi" w:cstheme="minorBidi"/>
+        <w:rFonts w:ascii="Times New Roman" w:hAnsi="Times New Roman" w:cs="Times New Roman" w:eastAsia="Times New Roman"/>
         <w:sz w:val="22"/>
         <w:szCs w:val="22"/>
         <w:lang w:val="en-US" w:eastAsia="en-US" w:bidi="ar-SA"/>
@@ -2542,7 +2439,7 @@
       <w:spacing w:after="160"/>
     </w:pPr>
     <w:rPr>
-      <w:rFonts w:ascii="Times New Roman" w:hAnsi="Times New Roman"/>
+      <w:rFonts w:ascii="Times New Roman" w:hAnsi="Times New Roman" w:cs="Times New Roman" w:eastAsia="Times New Roman"/>
       <w:sz w:val="22"/>
     </w:rPr>
   </w:style>
@@ -2605,7 +2502,7 @@
       <w:outlineLvl w:val="0"/>
     </w:pPr>
     <w:rPr>
-      <w:rFonts w:asciiTheme="majorHAnsi" w:eastAsiaTheme="majorEastAsia" w:hAnsiTheme="majorHAnsi" w:cstheme="majorBidi" w:ascii="Times New Roman" w:hAnsi="Times New Roman"/>
+      <w:rFonts w:ascii="Times New Roman" w:hAnsi="Times New Roman" w:cs="Times New Roman" w:eastAsia="Times New Roman"/>
       <w:b/>
       <w:bCs/>
       <w:color w:val="1F1F1F"/>
@@ -2629,7 +2526,7 @@
       <w:outlineLvl w:val="1"/>
     </w:pPr>
     <w:rPr>
-      <w:rFonts w:asciiTheme="majorHAnsi" w:eastAsiaTheme="majorEastAsia" w:hAnsiTheme="majorHAnsi" w:cstheme="majorBidi" w:ascii="Times New Roman" w:hAnsi="Times New Roman"/>
+      <w:rFonts w:ascii="Times New Roman" w:hAnsi="Times New Roman" w:cs="Times New Roman" w:eastAsia="Times New Roman"/>
       <w:b/>
       <w:bCs/>
       <w:color w:val="1F1F1F"/>
@@ -2653,7 +2550,7 @@
       <w:outlineLvl w:val="2"/>
     </w:pPr>
     <w:rPr>
-      <w:rFonts w:asciiTheme="majorHAnsi" w:eastAsiaTheme="majorEastAsia" w:hAnsiTheme="majorHAnsi" w:cstheme="majorBidi"/>
+      <w:rFonts w:ascii="Times New Roman" w:hAnsi="Times New Roman" w:cs="Times New Roman" w:eastAsia="Times New Roman"/>
       <w:b/>
       <w:bCs/>
       <w:color w:val="4F81BD" w:themeColor="accent1"/>
@@ -2676,7 +2573,7 @@
       <w:outlineLvl w:val="3"/>
     </w:pPr>
     <w:rPr>
-      <w:rFonts w:asciiTheme="majorHAnsi" w:eastAsiaTheme="majorEastAsia" w:hAnsiTheme="majorHAnsi" w:cstheme="majorBidi"/>
+      <w:rFonts w:ascii="Times New Roman" w:hAnsi="Times New Roman" w:cs="Times New Roman" w:eastAsia="Times New Roman"/>
       <w:b/>
       <w:bCs/>
       <w:i/>
@@ -2701,7 +2598,7 @@
       <w:outlineLvl w:val="4"/>
     </w:pPr>
     <w:rPr>
-      <w:rFonts w:asciiTheme="majorHAnsi" w:eastAsiaTheme="majorEastAsia" w:hAnsiTheme="majorHAnsi" w:cstheme="majorBidi"/>
+      <w:rFonts w:ascii="Times New Roman" w:hAnsi="Times New Roman" w:cs="Times New Roman" w:eastAsia="Times New Roman"/>
       <w:color w:val="243F60" w:themeColor="accent1" w:themeShade="7F"/>
     </w:rPr>
   </w:style>
@@ -2722,7 +2619,7 @@
       <w:outlineLvl w:val="5"/>
     </w:pPr>
     <w:rPr>
-      <w:rFonts w:asciiTheme="majorHAnsi" w:eastAsiaTheme="majorEastAsia" w:hAnsiTheme="majorHAnsi" w:cstheme="majorBidi"/>
+      <w:rFonts w:ascii="Times New Roman" w:hAnsi="Times New Roman" w:cs="Times New Roman" w:eastAsia="Times New Roman"/>
       <w:i/>
       <w:iCs/>
       <w:color w:val="243F60" w:themeColor="accent1" w:themeShade="7F"/>
@@ -2745,7 +2642,7 @@
       <w:outlineLvl w:val="6"/>
     </w:pPr>
     <w:rPr>
-      <w:rFonts w:asciiTheme="majorHAnsi" w:eastAsiaTheme="majorEastAsia" w:hAnsiTheme="majorHAnsi" w:cstheme="majorBidi"/>
+      <w:rFonts w:ascii="Times New Roman" w:hAnsi="Times New Roman" w:cs="Times New Roman" w:eastAsia="Times New Roman"/>
       <w:i/>
       <w:iCs/>
       <w:color w:val="404040" w:themeColor="text1" w:themeTint="BF"/>
@@ -2768,7 +2665,7 @@
       <w:outlineLvl w:val="7"/>
     </w:pPr>
     <w:rPr>
-      <w:rFonts w:asciiTheme="majorHAnsi" w:eastAsiaTheme="majorEastAsia" w:hAnsiTheme="majorHAnsi" w:cstheme="majorBidi"/>
+      <w:rFonts w:ascii="Times New Roman" w:hAnsi="Times New Roman" w:cs="Times New Roman" w:eastAsia="Times New Roman"/>
       <w:color w:val="4F81BD" w:themeColor="accent1"/>
       <w:sz w:val="20"/>
       <w:szCs w:val="20"/>
@@ -2791,7 +2688,7 @@
       <w:outlineLvl w:val="8"/>
     </w:pPr>
     <w:rPr>
-      <w:rFonts w:asciiTheme="majorHAnsi" w:eastAsiaTheme="majorEastAsia" w:hAnsiTheme="majorHAnsi" w:cstheme="majorBidi"/>
+      <w:rFonts w:ascii="Times New Roman" w:hAnsi="Times New Roman" w:cs="Times New Roman" w:eastAsia="Times New Roman"/>
       <w:i/>
       <w:iCs/>
       <w:color w:val="404040" w:themeColor="text1" w:themeTint="BF"/>
@@ -2842,7 +2739,7 @@
     <w:uiPriority w:val="9"/>
     <w:rsid w:val="00FC693F"/>
     <w:rPr>
-      <w:rFonts w:asciiTheme="majorHAnsi" w:eastAsiaTheme="majorEastAsia" w:hAnsiTheme="majorHAnsi" w:cstheme="majorBidi"/>
+      <w:rFonts w:ascii="Times New Roman" w:hAnsi="Times New Roman" w:cs="Times New Roman" w:eastAsia="Times New Roman"/>
       <w:b/>
       <w:bCs/>
       <w:color w:val="365F91" w:themeColor="accent1" w:themeShade="BF"/>
@@ -2857,7 +2754,7 @@
     <w:uiPriority w:val="9"/>
     <w:rsid w:val="00FC693F"/>
     <w:rPr>
-      <w:rFonts w:asciiTheme="majorHAnsi" w:eastAsiaTheme="majorEastAsia" w:hAnsiTheme="majorHAnsi" w:cstheme="majorBidi"/>
+      <w:rFonts w:ascii="Times New Roman" w:hAnsi="Times New Roman" w:cs="Times New Roman" w:eastAsia="Times New Roman"/>
       <w:b/>
       <w:bCs/>
       <w:color w:val="4F81BD" w:themeColor="accent1"/>
@@ -2872,7 +2769,7 @@
     <w:uiPriority w:val="9"/>
     <w:rsid w:val="00FC693F"/>
     <w:rPr>
-      <w:rFonts w:asciiTheme="majorHAnsi" w:eastAsiaTheme="majorEastAsia" w:hAnsiTheme="majorHAnsi" w:cstheme="majorBidi"/>
+      <w:rFonts w:ascii="Times New Roman" w:hAnsi="Times New Roman" w:cs="Times New Roman" w:eastAsia="Times New Roman"/>
       <w:b/>
       <w:bCs/>
       <w:color w:val="4F81BD" w:themeColor="accent1"/>
@@ -2894,7 +2791,7 @@
       <w:contextualSpacing/>
     </w:pPr>
     <w:rPr>
-      <w:rFonts w:asciiTheme="majorHAnsi" w:eastAsiaTheme="majorEastAsia" w:hAnsiTheme="majorHAnsi" w:cstheme="majorBidi"/>
+      <w:rFonts w:ascii="Times New Roman" w:hAnsi="Times New Roman" w:cs="Times New Roman" w:eastAsia="Times New Roman"/>
       <w:color w:val="17365D" w:themeColor="text2" w:themeShade="BF"/>
       <w:spacing w:val="5"/>
       <w:kern w:val="28"/>
@@ -2909,7 +2806,7 @@
     <w:uiPriority w:val="10"/>
     <w:rsid w:val="00FC693F"/>
     <w:rPr>
-      <w:rFonts w:asciiTheme="majorHAnsi" w:eastAsiaTheme="majorEastAsia" w:hAnsiTheme="majorHAnsi" w:cstheme="majorBidi"/>
+      <w:rFonts w:ascii="Times New Roman" w:hAnsi="Times New Roman" w:cs="Times New Roman" w:eastAsia="Times New Roman"/>
       <w:color w:val="17365D" w:themeColor="text2" w:themeShade="BF"/>
       <w:spacing w:val="5"/>
       <w:kern w:val="28"/>
@@ -2931,7 +2828,7 @@
       </w:numPr>
     </w:pPr>
     <w:rPr>
-      <w:rFonts w:asciiTheme="majorHAnsi" w:eastAsiaTheme="majorEastAsia" w:hAnsiTheme="majorHAnsi" w:cstheme="majorBidi"/>
+      <w:rFonts w:ascii="Times New Roman" w:hAnsi="Times New Roman" w:cs="Times New Roman" w:eastAsia="Times New Roman"/>
       <w:i/>
       <w:iCs/>
       <w:color w:val="4F81BD" w:themeColor="accent1"/>
@@ -2947,7 +2844,7 @@
     <w:uiPriority w:val="11"/>
     <w:rsid w:val="00FC693F"/>
     <w:rPr>
-      <w:rFonts w:asciiTheme="majorHAnsi" w:eastAsiaTheme="majorEastAsia" w:hAnsiTheme="majorHAnsi" w:cstheme="majorBidi"/>
+      <w:rFonts w:ascii="Times New Roman" w:hAnsi="Times New Roman" w:cs="Times New Roman" w:eastAsia="Times New Roman"/>
       <w:i/>
       <w:iCs/>
       <w:color w:val="4F81BD" w:themeColor="accent1"/>
@@ -3194,7 +3091,7 @@
       </w:tabs>
     </w:pPr>
     <w:rPr>
-      <w:rFonts w:ascii="Courier" w:hAnsi="Courier"/>
+      <w:rFonts w:ascii="Times New Roman" w:hAnsi="Times New Roman" w:cs="Times New Roman" w:eastAsia="Times New Roman"/>
       <w:sz w:val="20"/>
       <w:szCs w:val="20"/>
     </w:rPr>
@@ -3206,7 +3103,7 @@
     <w:uiPriority w:val="99"/>
     <w:rsid w:val="0029639D"/>
     <w:rPr>
-      <w:rFonts w:ascii="Courier" w:hAnsi="Courier"/>
+      <w:rFonts w:ascii="Times New Roman" w:hAnsi="Times New Roman" w:cs="Times New Roman" w:eastAsia="Times New Roman"/>
       <w:sz w:val="20"/>
       <w:szCs w:val="20"/>
     </w:rPr>
@@ -3245,7 +3142,7 @@
     <w:semiHidden/>
     <w:rsid w:val="00FC693F"/>
     <w:rPr>
-      <w:rFonts w:asciiTheme="majorHAnsi" w:eastAsiaTheme="majorEastAsia" w:hAnsiTheme="majorHAnsi" w:cstheme="majorBidi"/>
+      <w:rFonts w:ascii="Times New Roman" w:hAnsi="Times New Roman" w:cs="Times New Roman" w:eastAsia="Times New Roman"/>
       <w:b/>
       <w:bCs/>
       <w:i/>
@@ -3261,7 +3158,7 @@
     <w:semiHidden/>
     <w:rsid w:val="00FC693F"/>
     <w:rPr>
-      <w:rFonts w:asciiTheme="majorHAnsi" w:eastAsiaTheme="majorEastAsia" w:hAnsiTheme="majorHAnsi" w:cstheme="majorBidi"/>
+      <w:rFonts w:ascii="Times New Roman" w:hAnsi="Times New Roman" w:cs="Times New Roman" w:eastAsia="Times New Roman"/>
       <w:color w:val="243F60" w:themeColor="accent1" w:themeShade="7F"/>
     </w:rPr>
   </w:style>
@@ -3273,7 +3170,7 @@
     <w:semiHidden/>
     <w:rsid w:val="00FC693F"/>
     <w:rPr>
-      <w:rFonts w:asciiTheme="majorHAnsi" w:eastAsiaTheme="majorEastAsia" w:hAnsiTheme="majorHAnsi" w:cstheme="majorBidi"/>
+      <w:rFonts w:ascii="Times New Roman" w:hAnsi="Times New Roman" w:cs="Times New Roman" w:eastAsia="Times New Roman"/>
       <w:i/>
       <w:iCs/>
       <w:color w:val="243F60" w:themeColor="accent1" w:themeShade="7F"/>
@@ -3287,7 +3184,7 @@
     <w:semiHidden/>
     <w:rsid w:val="00FC693F"/>
     <w:rPr>
-      <w:rFonts w:asciiTheme="majorHAnsi" w:eastAsiaTheme="majorEastAsia" w:hAnsiTheme="majorHAnsi" w:cstheme="majorBidi"/>
+      <w:rFonts w:ascii="Times New Roman" w:hAnsi="Times New Roman" w:cs="Times New Roman" w:eastAsia="Times New Roman"/>
       <w:i/>
       <w:iCs/>
       <w:color w:val="404040" w:themeColor="text1" w:themeTint="BF"/>
@@ -3301,7 +3198,7 @@
     <w:semiHidden/>
     <w:rsid w:val="00FC693F"/>
     <w:rPr>
-      <w:rFonts w:asciiTheme="majorHAnsi" w:eastAsiaTheme="majorEastAsia" w:hAnsiTheme="majorHAnsi" w:cstheme="majorBidi"/>
+      <w:rFonts w:ascii="Times New Roman" w:hAnsi="Times New Roman" w:cs="Times New Roman" w:eastAsia="Times New Roman"/>
       <w:color w:val="4F81BD" w:themeColor="accent1"/>
       <w:sz w:val="20"/>
       <w:szCs w:val="20"/>
@@ -3315,7 +3212,7 @@
     <w:semiHidden/>
     <w:rsid w:val="00FC693F"/>
     <w:rPr>
-      <w:rFonts w:asciiTheme="majorHAnsi" w:eastAsiaTheme="majorEastAsia" w:hAnsiTheme="majorHAnsi" w:cstheme="majorBidi"/>
+      <w:rFonts w:ascii="Times New Roman" w:hAnsi="Times New Roman" w:cs="Times New Roman" w:eastAsia="Times New Roman"/>
       <w:i/>
       <w:iCs/>
       <w:color w:val="404040" w:themeColor="text1" w:themeTint="BF"/>
@@ -4904,7 +4801,7 @@
         <w:spacing w:before="0" w:after="0" w:line="240" w:lineRule="auto"/>
       </w:pPr>
       <w:rPr>
-        <w:rFonts w:asciiTheme="majorHAnsi" w:eastAsiaTheme="majorEastAsia" w:hAnsiTheme="majorHAnsi" w:cstheme="majorBidi"/>
+        <w:rFonts w:ascii="Times New Roman" w:hAnsi="Times New Roman" w:cs="Times New Roman" w:eastAsia="Times New Roman"/>
         <w:b/>
         <w:bCs/>
       </w:rPr>
@@ -4925,7 +4822,7 @@
         <w:spacing w:before="0" w:after="0" w:line="240" w:lineRule="auto"/>
       </w:pPr>
       <w:rPr>
-        <w:rFonts w:asciiTheme="majorHAnsi" w:eastAsiaTheme="majorEastAsia" w:hAnsiTheme="majorHAnsi" w:cstheme="majorBidi"/>
+        <w:rFonts w:ascii="Times New Roman" w:hAnsi="Times New Roman" w:cs="Times New Roman" w:eastAsia="Times New Roman"/>
         <w:b/>
         <w:bCs/>
       </w:rPr>
@@ -4943,14 +4840,14 @@
     </w:tblStylePr>
     <w:tblStylePr w:type="firstCol">
       <w:rPr>
-        <w:rFonts w:asciiTheme="majorHAnsi" w:eastAsiaTheme="majorEastAsia" w:hAnsiTheme="majorHAnsi" w:cstheme="majorBidi"/>
+        <w:rFonts w:ascii="Times New Roman" w:hAnsi="Times New Roman" w:cs="Times New Roman" w:eastAsia="Times New Roman"/>
         <w:b/>
         <w:bCs/>
       </w:rPr>
     </w:tblStylePr>
     <w:tblStylePr w:type="lastCol">
       <w:rPr>
-        <w:rFonts w:asciiTheme="majorHAnsi" w:eastAsiaTheme="majorEastAsia" w:hAnsiTheme="majorHAnsi" w:cstheme="majorBidi"/>
+        <w:rFonts w:ascii="Times New Roman" w:hAnsi="Times New Roman" w:cs="Times New Roman" w:eastAsia="Times New Roman"/>
         <w:b/>
         <w:bCs/>
       </w:rPr>
@@ -5034,7 +4931,7 @@
         <w:spacing w:before="0" w:after="0" w:line="240" w:lineRule="auto"/>
       </w:pPr>
       <w:rPr>
-        <w:rFonts w:asciiTheme="majorHAnsi" w:eastAsiaTheme="majorEastAsia" w:hAnsiTheme="majorHAnsi" w:cstheme="majorBidi"/>
+        <w:rFonts w:ascii="Times New Roman" w:hAnsi="Times New Roman" w:cs="Times New Roman" w:eastAsia="Times New Roman"/>
         <w:b/>
         <w:bCs/>
       </w:rPr>
@@ -5055,7 +4952,7 @@
         <w:spacing w:before="0" w:after="0" w:line="240" w:lineRule="auto"/>
       </w:pPr>
       <w:rPr>
-        <w:rFonts w:asciiTheme="majorHAnsi" w:eastAsiaTheme="majorEastAsia" w:hAnsiTheme="majorHAnsi" w:cstheme="majorBidi"/>
+        <w:rFonts w:ascii="Times New Roman" w:hAnsi="Times New Roman" w:cs="Times New Roman" w:eastAsia="Times New Roman"/>
         <w:b/>
         <w:bCs/>
       </w:rPr>
@@ -5073,14 +4970,14 @@
     </w:tblStylePr>
     <w:tblStylePr w:type="firstCol">
       <w:rPr>
-        <w:rFonts w:asciiTheme="majorHAnsi" w:eastAsiaTheme="majorEastAsia" w:hAnsiTheme="majorHAnsi" w:cstheme="majorBidi"/>
+        <w:rFonts w:ascii="Times New Roman" w:hAnsi="Times New Roman" w:cs="Times New Roman" w:eastAsia="Times New Roman"/>
         <w:b/>
         <w:bCs/>
       </w:rPr>
     </w:tblStylePr>
     <w:tblStylePr w:type="lastCol">
       <w:rPr>
-        <w:rFonts w:asciiTheme="majorHAnsi" w:eastAsiaTheme="majorEastAsia" w:hAnsiTheme="majorHAnsi" w:cstheme="majorBidi"/>
+        <w:rFonts w:ascii="Times New Roman" w:hAnsi="Times New Roman" w:cs="Times New Roman" w:eastAsia="Times New Roman"/>
         <w:b/>
         <w:bCs/>
       </w:rPr>
@@ -5164,7 +5061,7 @@
         <w:spacing w:before="0" w:after="0" w:line="240" w:lineRule="auto"/>
       </w:pPr>
       <w:rPr>
-        <w:rFonts w:asciiTheme="majorHAnsi" w:eastAsiaTheme="majorEastAsia" w:hAnsiTheme="majorHAnsi" w:cstheme="majorBidi"/>
+        <w:rFonts w:ascii="Times New Roman" w:hAnsi="Times New Roman" w:cs="Times New Roman" w:eastAsia="Times New Roman"/>
         <w:b/>
         <w:bCs/>
       </w:rPr>
@@ -5185,7 +5082,7 @@
         <w:spacing w:before="0" w:after="0" w:line="240" w:lineRule="auto"/>
       </w:pPr>
       <w:rPr>
-        <w:rFonts w:asciiTheme="majorHAnsi" w:eastAsiaTheme="majorEastAsia" w:hAnsiTheme="majorHAnsi" w:cstheme="majorBidi"/>
+        <w:rFonts w:ascii="Times New Roman" w:hAnsi="Times New Roman" w:cs="Times New Roman" w:eastAsia="Times New Roman"/>
         <w:b/>
         <w:bCs/>
       </w:rPr>
@@ -5203,14 +5100,14 @@
     </w:tblStylePr>
     <w:tblStylePr w:type="firstCol">
       <w:rPr>
-        <w:rFonts w:asciiTheme="majorHAnsi" w:eastAsiaTheme="majorEastAsia" w:hAnsiTheme="majorHAnsi" w:cstheme="majorBidi"/>
+        <w:rFonts w:ascii="Times New Roman" w:hAnsi="Times New Roman" w:cs="Times New Roman" w:eastAsia="Times New Roman"/>
         <w:b/>
         <w:bCs/>
       </w:rPr>
     </w:tblStylePr>
     <w:tblStylePr w:type="lastCol">
       <w:rPr>
-        <w:rFonts w:asciiTheme="majorHAnsi" w:eastAsiaTheme="majorEastAsia" w:hAnsiTheme="majorHAnsi" w:cstheme="majorBidi"/>
+        <w:rFonts w:ascii="Times New Roman" w:hAnsi="Times New Roman" w:cs="Times New Roman" w:eastAsia="Times New Roman"/>
         <w:b/>
         <w:bCs/>
       </w:rPr>
@@ -5294,7 +5191,7 @@
         <w:spacing w:before="0" w:after="0" w:line="240" w:lineRule="auto"/>
       </w:pPr>
       <w:rPr>
-        <w:rFonts w:asciiTheme="majorHAnsi" w:eastAsiaTheme="majorEastAsia" w:hAnsiTheme="majorHAnsi" w:cstheme="majorBidi"/>
+        <w:rFonts w:ascii="Times New Roman" w:hAnsi="Times New Roman" w:cs="Times New Roman" w:eastAsia="Times New Roman"/>
         <w:b/>
         <w:bCs/>
       </w:rPr>
@@ -5315,7 +5212,7 @@
         <w:spacing w:before="0" w:after="0" w:line="240" w:lineRule="auto"/>
       </w:pPr>
       <w:rPr>
-        <w:rFonts w:asciiTheme="majorHAnsi" w:eastAsiaTheme="majorEastAsia" w:hAnsiTheme="majorHAnsi" w:cstheme="majorBidi"/>
+        <w:rFonts w:ascii="Times New Roman" w:hAnsi="Times New Roman" w:cs="Times New Roman" w:eastAsia="Times New Roman"/>
         <w:b/>
         <w:bCs/>
       </w:rPr>
@@ -5333,14 +5230,14 @@
     </w:tblStylePr>
     <w:tblStylePr w:type="firstCol">
       <w:rPr>
-        <w:rFonts w:asciiTheme="majorHAnsi" w:eastAsiaTheme="majorEastAsia" w:hAnsiTheme="majorHAnsi" w:cstheme="majorBidi"/>
+        <w:rFonts w:ascii="Times New Roman" w:hAnsi="Times New Roman" w:cs="Times New Roman" w:eastAsia="Times New Roman"/>
         <w:b/>
         <w:bCs/>
       </w:rPr>
     </w:tblStylePr>
     <w:tblStylePr w:type="lastCol">
       <w:rPr>
-        <w:rFonts w:asciiTheme="majorHAnsi" w:eastAsiaTheme="majorEastAsia" w:hAnsiTheme="majorHAnsi" w:cstheme="majorBidi"/>
+        <w:rFonts w:ascii="Times New Roman" w:hAnsi="Times New Roman" w:cs="Times New Roman" w:eastAsia="Times New Roman"/>
         <w:b/>
         <w:bCs/>
       </w:rPr>
@@ -5424,7 +5321,7 @@
         <w:spacing w:before="0" w:after="0" w:line="240" w:lineRule="auto"/>
       </w:pPr>
       <w:rPr>
-        <w:rFonts w:asciiTheme="majorHAnsi" w:eastAsiaTheme="majorEastAsia" w:hAnsiTheme="majorHAnsi" w:cstheme="majorBidi"/>
+        <w:rFonts w:ascii="Times New Roman" w:hAnsi="Times New Roman" w:cs="Times New Roman" w:eastAsia="Times New Roman"/>
         <w:b/>
         <w:bCs/>
       </w:rPr>
@@ -5445,7 +5342,7 @@
         <w:spacing w:before="0" w:after="0" w:line="240" w:lineRule="auto"/>
       </w:pPr>
       <w:rPr>
-        <w:rFonts w:asciiTheme="majorHAnsi" w:eastAsiaTheme="majorEastAsia" w:hAnsiTheme="majorHAnsi" w:cstheme="majorBidi"/>
+        <w:rFonts w:ascii="Times New Roman" w:hAnsi="Times New Roman" w:cs="Times New Roman" w:eastAsia="Times New Roman"/>
         <w:b/>
         <w:bCs/>
       </w:rPr>
@@ -5463,14 +5360,14 @@
     </w:tblStylePr>
     <w:tblStylePr w:type="firstCol">
       <w:rPr>
-        <w:rFonts w:asciiTheme="majorHAnsi" w:eastAsiaTheme="majorEastAsia" w:hAnsiTheme="majorHAnsi" w:cstheme="majorBidi"/>
+        <w:rFonts w:ascii="Times New Roman" w:hAnsi="Times New Roman" w:cs="Times New Roman" w:eastAsia="Times New Roman"/>
         <w:b/>
         <w:bCs/>
       </w:rPr>
     </w:tblStylePr>
     <w:tblStylePr w:type="lastCol">
       <w:rPr>
-        <w:rFonts w:asciiTheme="majorHAnsi" w:eastAsiaTheme="majorEastAsia" w:hAnsiTheme="majorHAnsi" w:cstheme="majorBidi"/>
+        <w:rFonts w:ascii="Times New Roman" w:hAnsi="Times New Roman" w:cs="Times New Roman" w:eastAsia="Times New Roman"/>
         <w:b/>
         <w:bCs/>
       </w:rPr>
@@ -5554,7 +5451,7 @@
         <w:spacing w:before="0" w:after="0" w:line="240" w:lineRule="auto"/>
       </w:pPr>
       <w:rPr>
-        <w:rFonts w:asciiTheme="majorHAnsi" w:eastAsiaTheme="majorEastAsia" w:hAnsiTheme="majorHAnsi" w:cstheme="majorBidi"/>
+        <w:rFonts w:ascii="Times New Roman" w:hAnsi="Times New Roman" w:cs="Times New Roman" w:eastAsia="Times New Roman"/>
         <w:b/>
         <w:bCs/>
       </w:rPr>
@@ -5575,7 +5472,7 @@
         <w:spacing w:before="0" w:after="0" w:line="240" w:lineRule="auto"/>
       </w:pPr>
       <w:rPr>
-        <w:rFonts w:asciiTheme="majorHAnsi" w:eastAsiaTheme="majorEastAsia" w:hAnsiTheme="majorHAnsi" w:cstheme="majorBidi"/>
+        <w:rFonts w:ascii="Times New Roman" w:hAnsi="Times New Roman" w:cs="Times New Roman" w:eastAsia="Times New Roman"/>
         <w:b/>
         <w:bCs/>
       </w:rPr>
@@ -5593,14 +5490,14 @@
     </w:tblStylePr>
     <w:tblStylePr w:type="firstCol">
       <w:rPr>
-        <w:rFonts w:asciiTheme="majorHAnsi" w:eastAsiaTheme="majorEastAsia" w:hAnsiTheme="majorHAnsi" w:cstheme="majorBidi"/>
+        <w:rFonts w:ascii="Times New Roman" w:hAnsi="Times New Roman" w:cs="Times New Roman" w:eastAsia="Times New Roman"/>
         <w:b/>
         <w:bCs/>
       </w:rPr>
     </w:tblStylePr>
     <w:tblStylePr w:type="lastCol">
       <w:rPr>
-        <w:rFonts w:asciiTheme="majorHAnsi" w:eastAsiaTheme="majorEastAsia" w:hAnsiTheme="majorHAnsi" w:cstheme="majorBidi"/>
+        <w:rFonts w:ascii="Times New Roman" w:hAnsi="Times New Roman" w:cs="Times New Roman" w:eastAsia="Times New Roman"/>
         <w:b/>
         <w:bCs/>
       </w:rPr>
@@ -5684,7 +5581,7 @@
         <w:spacing w:before="0" w:after="0" w:line="240" w:lineRule="auto"/>
       </w:pPr>
       <w:rPr>
-        <w:rFonts w:asciiTheme="majorHAnsi" w:eastAsiaTheme="majorEastAsia" w:hAnsiTheme="majorHAnsi" w:cstheme="majorBidi"/>
+        <w:rFonts w:ascii="Times New Roman" w:hAnsi="Times New Roman" w:cs="Times New Roman" w:eastAsia="Times New Roman"/>
         <w:b/>
         <w:bCs/>
       </w:rPr>
@@ -5705,7 +5602,7 @@
         <w:spacing w:before="0" w:after="0" w:line="240" w:lineRule="auto"/>
       </w:pPr>
       <w:rPr>
-        <w:rFonts w:asciiTheme="majorHAnsi" w:eastAsiaTheme="majorEastAsia" w:hAnsiTheme="majorHAnsi" w:cstheme="majorBidi"/>
+        <w:rFonts w:ascii="Times New Roman" w:hAnsi="Times New Roman" w:cs="Times New Roman" w:eastAsia="Times New Roman"/>
         <w:b/>
         <w:bCs/>
       </w:rPr>
@@ -5723,14 +5620,14 @@
     </w:tblStylePr>
     <w:tblStylePr w:type="firstCol">
       <w:rPr>
-        <w:rFonts w:asciiTheme="majorHAnsi" w:eastAsiaTheme="majorEastAsia" w:hAnsiTheme="majorHAnsi" w:cstheme="majorBidi"/>
+        <w:rFonts w:ascii="Times New Roman" w:hAnsi="Times New Roman" w:cs="Times New Roman" w:eastAsia="Times New Roman"/>
         <w:b/>
         <w:bCs/>
       </w:rPr>
     </w:tblStylePr>
     <w:tblStylePr w:type="lastCol">
       <w:rPr>
-        <w:rFonts w:asciiTheme="majorHAnsi" w:eastAsiaTheme="majorEastAsia" w:hAnsiTheme="majorHAnsi" w:cstheme="majorBidi"/>
+        <w:rFonts w:ascii="Times New Roman" w:hAnsi="Times New Roman" w:cs="Times New Roman" w:eastAsia="Times New Roman"/>
         <w:b/>
         <w:bCs/>
       </w:rPr>
@@ -7595,7 +7492,7 @@
     </w:tblPr>
     <w:tblStylePr w:type="firstRow">
       <w:rPr>
-        <w:rFonts w:asciiTheme="majorHAnsi" w:eastAsiaTheme="majorEastAsia" w:hAnsiTheme="majorHAnsi" w:cstheme="majorBidi"/>
+        <w:rFonts w:ascii="Times New Roman" w:hAnsi="Times New Roman" w:cs="Times New Roman" w:eastAsia="Times New Roman"/>
       </w:rPr>
       <w:tblPr/>
       <w:tcPr>
@@ -7679,7 +7576,7 @@
     </w:tblPr>
     <w:tblStylePr w:type="firstRow">
       <w:rPr>
-        <w:rFonts w:asciiTheme="majorHAnsi" w:eastAsiaTheme="majorEastAsia" w:hAnsiTheme="majorHAnsi" w:cstheme="majorBidi"/>
+        <w:rFonts w:ascii="Times New Roman" w:hAnsi="Times New Roman" w:cs="Times New Roman" w:eastAsia="Times New Roman"/>
       </w:rPr>
       <w:tblPr/>
       <w:tcPr>
@@ -7763,7 +7660,7 @@
     </w:tblPr>
     <w:tblStylePr w:type="firstRow">
       <w:rPr>
-        <w:rFonts w:asciiTheme="majorHAnsi" w:eastAsiaTheme="majorEastAsia" w:hAnsiTheme="majorHAnsi" w:cstheme="majorBidi"/>
+        <w:rFonts w:ascii="Times New Roman" w:hAnsi="Times New Roman" w:cs="Times New Roman" w:eastAsia="Times New Roman"/>
       </w:rPr>
       <w:tblPr/>
       <w:tcPr>
@@ -7847,7 +7744,7 @@
     </w:tblPr>
     <w:tblStylePr w:type="firstRow">
       <w:rPr>
-        <w:rFonts w:asciiTheme="majorHAnsi" w:eastAsiaTheme="majorEastAsia" w:hAnsiTheme="majorHAnsi" w:cstheme="majorBidi"/>
+        <w:rFonts w:ascii="Times New Roman" w:hAnsi="Times New Roman" w:cs="Times New Roman" w:eastAsia="Times New Roman"/>
       </w:rPr>
       <w:tblPr/>
       <w:tcPr>
@@ -7931,7 +7828,7 @@
     </w:tblPr>
     <w:tblStylePr w:type="firstRow">
       <w:rPr>
-        <w:rFonts w:asciiTheme="majorHAnsi" w:eastAsiaTheme="majorEastAsia" w:hAnsiTheme="majorHAnsi" w:cstheme="majorBidi"/>
+        <w:rFonts w:ascii="Times New Roman" w:hAnsi="Times New Roman" w:cs="Times New Roman" w:eastAsia="Times New Roman"/>
       </w:rPr>
       <w:tblPr/>
       <w:tcPr>
@@ -8015,7 +7912,7 @@
     </w:tblPr>
     <w:tblStylePr w:type="firstRow">
       <w:rPr>
-        <w:rFonts w:asciiTheme="majorHAnsi" w:eastAsiaTheme="majorEastAsia" w:hAnsiTheme="majorHAnsi" w:cstheme="majorBidi"/>
+        <w:rFonts w:ascii="Times New Roman" w:hAnsi="Times New Roman" w:cs="Times New Roman" w:eastAsia="Times New Roman"/>
       </w:rPr>
       <w:tblPr/>
       <w:tcPr>
@@ -8099,7 +7996,7 @@
     </w:tblPr>
     <w:tblStylePr w:type="firstRow">
       <w:rPr>
-        <w:rFonts w:asciiTheme="majorHAnsi" w:eastAsiaTheme="majorEastAsia" w:hAnsiTheme="majorHAnsi" w:cstheme="majorBidi"/>
+        <w:rFonts w:ascii="Times New Roman" w:hAnsi="Times New Roman" w:cs="Times New Roman" w:eastAsia="Times New Roman"/>
       </w:rPr>
       <w:tblPr/>
       <w:tcPr>
@@ -8164,7 +8061,7 @@
       <w:spacing w:after="0" w:line="240" w:lineRule="auto"/>
     </w:pPr>
     <w:rPr>
-      <w:rFonts w:asciiTheme="majorHAnsi" w:eastAsiaTheme="majorEastAsia" w:hAnsiTheme="majorHAnsi" w:cstheme="majorBidi"/>
+      <w:rFonts w:ascii="Times New Roman" w:hAnsi="Times New Roman" w:cs="Times New Roman" w:eastAsia="Times New Roman"/>
       <w:color w:val="000000" w:themeColor="text1"/>
     </w:rPr>
     <w:tblPr>
@@ -8292,7 +8189,7 @@
       <w:spacing w:after="0" w:line="240" w:lineRule="auto"/>
     </w:pPr>
     <w:rPr>
-      <w:rFonts w:asciiTheme="majorHAnsi" w:eastAsiaTheme="majorEastAsia" w:hAnsiTheme="majorHAnsi" w:cstheme="majorBidi"/>
+      <w:rFonts w:ascii="Times New Roman" w:hAnsi="Times New Roman" w:cs="Times New Roman" w:eastAsia="Times New Roman"/>
       <w:color w:val="000000" w:themeColor="text1"/>
     </w:rPr>
     <w:tblPr>
@@ -8420,7 +8317,7 @@
       <w:spacing w:after="0" w:line="240" w:lineRule="auto"/>
     </w:pPr>
     <w:rPr>
-      <w:rFonts w:asciiTheme="majorHAnsi" w:eastAsiaTheme="majorEastAsia" w:hAnsiTheme="majorHAnsi" w:cstheme="majorBidi"/>
+      <w:rFonts w:ascii="Times New Roman" w:hAnsi="Times New Roman" w:cs="Times New Roman" w:eastAsia="Times New Roman"/>
       <w:color w:val="000000" w:themeColor="text1"/>
     </w:rPr>
     <w:tblPr>
@@ -8548,7 +8445,7 @@
       <w:spacing w:after="0" w:line="240" w:lineRule="auto"/>
     </w:pPr>
     <w:rPr>
-      <w:rFonts w:asciiTheme="majorHAnsi" w:eastAsiaTheme="majorEastAsia" w:hAnsiTheme="majorHAnsi" w:cstheme="majorBidi"/>
+      <w:rFonts w:ascii="Times New Roman" w:hAnsi="Times New Roman" w:cs="Times New Roman" w:eastAsia="Times New Roman"/>
       <w:color w:val="000000" w:themeColor="text1"/>
     </w:rPr>
     <w:tblPr>
@@ -8676,7 +8573,7 @@
       <w:spacing w:after="0" w:line="240" w:lineRule="auto"/>
     </w:pPr>
     <w:rPr>
-      <w:rFonts w:asciiTheme="majorHAnsi" w:eastAsiaTheme="majorEastAsia" w:hAnsiTheme="majorHAnsi" w:cstheme="majorBidi"/>
+      <w:rFonts w:ascii="Times New Roman" w:hAnsi="Times New Roman" w:cs="Times New Roman" w:eastAsia="Times New Roman"/>
       <w:color w:val="000000" w:themeColor="text1"/>
     </w:rPr>
     <w:tblPr>
@@ -8804,7 +8701,7 @@
       <w:spacing w:after="0" w:line="240" w:lineRule="auto"/>
     </w:pPr>
     <w:rPr>
-      <w:rFonts w:asciiTheme="majorHAnsi" w:eastAsiaTheme="majorEastAsia" w:hAnsiTheme="majorHAnsi" w:cstheme="majorBidi"/>
+      <w:rFonts w:ascii="Times New Roman" w:hAnsi="Times New Roman" w:cs="Times New Roman" w:eastAsia="Times New Roman"/>
       <w:color w:val="000000" w:themeColor="text1"/>
     </w:rPr>
     <w:tblPr>
@@ -8932,7 +8829,7 @@
       <w:spacing w:after="0" w:line="240" w:lineRule="auto"/>
     </w:pPr>
     <w:rPr>
-      <w:rFonts w:asciiTheme="majorHAnsi" w:eastAsiaTheme="majorEastAsia" w:hAnsiTheme="majorHAnsi" w:cstheme="majorBidi"/>
+      <w:rFonts w:ascii="Times New Roman" w:hAnsi="Times New Roman" w:cs="Times New Roman" w:eastAsia="Times New Roman"/>
       <w:color w:val="000000" w:themeColor="text1"/>
     </w:rPr>
     <w:tblPr>
@@ -9571,7 +9468,7 @@
       <w:spacing w:after="0" w:line="240" w:lineRule="auto"/>
     </w:pPr>
     <w:rPr>
-      <w:rFonts w:asciiTheme="majorHAnsi" w:eastAsiaTheme="majorEastAsia" w:hAnsiTheme="majorHAnsi" w:cstheme="majorBidi"/>
+      <w:rFonts w:ascii="Times New Roman" w:hAnsi="Times New Roman" w:cs="Times New Roman" w:eastAsia="Times New Roman"/>
       <w:color w:val="000000" w:themeColor="text1"/>
     </w:rPr>
     <w:tblPr>
@@ -9696,7 +9593,7 @@
       <w:spacing w:after="0" w:line="240" w:lineRule="auto"/>
     </w:pPr>
     <w:rPr>
-      <w:rFonts w:asciiTheme="majorHAnsi" w:eastAsiaTheme="majorEastAsia" w:hAnsiTheme="majorHAnsi" w:cstheme="majorBidi"/>
+      <w:rFonts w:ascii="Times New Roman" w:hAnsi="Times New Roman" w:cs="Times New Roman" w:eastAsia="Times New Roman"/>
       <w:color w:val="000000" w:themeColor="text1"/>
     </w:rPr>
     <w:tblPr>
@@ -9821,7 +9718,7 @@
       <w:spacing w:after="0" w:line="240" w:lineRule="auto"/>
     </w:pPr>
     <w:rPr>
-      <w:rFonts w:asciiTheme="majorHAnsi" w:eastAsiaTheme="majorEastAsia" w:hAnsiTheme="majorHAnsi" w:cstheme="majorBidi"/>
+      <w:rFonts w:ascii="Times New Roman" w:hAnsi="Times New Roman" w:cs="Times New Roman" w:eastAsia="Times New Roman"/>
       <w:color w:val="000000" w:themeColor="text1"/>
     </w:rPr>
     <w:tblPr>
@@ -9946,7 +9843,7 @@
       <w:spacing w:after="0" w:line="240" w:lineRule="auto"/>
     </w:pPr>
     <w:rPr>
-      <w:rFonts w:asciiTheme="majorHAnsi" w:eastAsiaTheme="majorEastAsia" w:hAnsiTheme="majorHAnsi" w:cstheme="majorBidi"/>
+      <w:rFonts w:ascii="Times New Roman" w:hAnsi="Times New Roman" w:cs="Times New Roman" w:eastAsia="Times New Roman"/>
       <w:color w:val="000000" w:themeColor="text1"/>
     </w:rPr>
     <w:tblPr>
@@ -10071,7 +9968,7 @@
       <w:spacing w:after="0" w:line="240" w:lineRule="auto"/>
     </w:pPr>
     <w:rPr>
-      <w:rFonts w:asciiTheme="majorHAnsi" w:eastAsiaTheme="majorEastAsia" w:hAnsiTheme="majorHAnsi" w:cstheme="majorBidi"/>
+      <w:rFonts w:ascii="Times New Roman" w:hAnsi="Times New Roman" w:cs="Times New Roman" w:eastAsia="Times New Roman"/>
       <w:color w:val="000000" w:themeColor="text1"/>
     </w:rPr>
     <w:tblPr>
@@ -10196,7 +10093,7 @@
       <w:spacing w:after="0" w:line="240" w:lineRule="auto"/>
     </w:pPr>
     <w:rPr>
-      <w:rFonts w:asciiTheme="majorHAnsi" w:eastAsiaTheme="majorEastAsia" w:hAnsiTheme="majorHAnsi" w:cstheme="majorBidi"/>
+      <w:rFonts w:ascii="Times New Roman" w:hAnsi="Times New Roman" w:cs="Times New Roman" w:eastAsia="Times New Roman"/>
       <w:color w:val="000000" w:themeColor="text1"/>
     </w:rPr>
     <w:tblPr>
@@ -10321,7 +10218,7 @@
       <w:spacing w:after="0" w:line="240" w:lineRule="auto"/>
     </w:pPr>
     <w:rPr>
-      <w:rFonts w:asciiTheme="majorHAnsi" w:eastAsiaTheme="majorEastAsia" w:hAnsiTheme="majorHAnsi" w:cstheme="majorBidi"/>
+      <w:rFonts w:ascii="Times New Roman" w:hAnsi="Times New Roman" w:cs="Times New Roman" w:eastAsia="Times New Roman"/>
       <w:color w:val="000000" w:themeColor="text1"/>
     </w:rPr>
     <w:tblPr>
@@ -26076,7 +25973,7 @@
     </a:clrScheme>
     <a:fontScheme name="Office">
       <a:majorFont>
-        <a:latin typeface="Calibri"/>
+        <a:latin typeface="Times New Roman"/>
         <a:ea typeface=""/>
         <a:cs typeface=""/>
         <a:font script="Jpan" typeface="ＭＳ ゴシック"/>
@@ -26111,7 +26008,7 @@
         <a:font script="Geor" typeface="Sylfaen"/>
       </a:majorFont>
       <a:minorFont>
-        <a:latin typeface="Cambria"/>
+        <a:latin typeface="Times New Roman"/>
         <a:ea typeface=""/>
         <a:cs typeface=""/>
         <a:font script="Jpan" typeface="ＭＳ 明朝"/>

</xml_diff>